<commit_message>
Widget docs: add screenshots + PDF; fix widget host to block width
</commit_message>
<xml_diff>
--- a/public/AuthentiScan_Widget_Documentation.docx
+++ b/public/AuthentiScan_Widget_Documentation.docx
@@ -383,6 +383,60 @@
           <w:sz w:val="20"/>
         </w:rPr>
         <w:t>ℹ  The widget reuses the same analysis pipeline as the main AuthentiScan Pro application (Claude AI with real-time web search). The score shown in the badge is identical to the score a user would obtain by submitting the same URL in the app.</w:t>
+      </w:r>
+    </w:p>
+    <w:p>
+      <w:pPr>
+        <w:spacing w:before="120"/>
+        <w:jc w:val="center"/>
+      </w:pPr>
+      <w:r>
+        <w:drawing>
+          <wp:inline xmlns:a="http://schemas.openxmlformats.org/drawingml/2006/main" xmlns:pic="http://schemas.openxmlformats.org/drawingml/2006/picture">
+            <wp:extent cx="5760720" cy="4270879"/>
+            <wp:docPr id="1" name="Picture 1"/>
+            <wp:cNvGraphicFramePr>
+              <a:graphicFrameLocks noChangeAspect="1"/>
+            </wp:cNvGraphicFramePr>
+            <a:graphic>
+              <a:graphicData uri="http://schemas.openxmlformats.org/drawingml/2006/picture">
+                <pic:pic>
+                  <pic:nvPicPr>
+                    <pic:cNvPr id="0" name="article.png"/>
+                    <pic:cNvPicPr/>
+                  </pic:nvPicPr>
+                  <pic:blipFill>
+                    <a:blip r:embed="rId9"/>
+                    <a:stretch>
+                      <a:fillRect/>
+                    </a:stretch>
+                  </pic:blipFill>
+                  <pic:spPr>
+                    <a:xfrm>
+                      <a:off x="0" y="0"/>
+                      <a:ext cx="5760720" cy="4270879"/>
+                    </a:xfrm>
+                    <a:prstGeom prst="rect"/>
+                  </pic:spPr>
+                </pic:pic>
+              </a:graphicData>
+            </a:graphic>
+          </wp:inline>
+        </w:drawing>
+      </w:r>
+    </w:p>
+    <w:p>
+      <w:pPr>
+        <w:spacing w:after="200"/>
+        <w:jc w:val="center"/>
+      </w:pPr>
+      <w:r>
+        <w:rPr>
+          <w:i/>
+          <w:color w:val="666666"/>
+          <w:sz w:val="18"/>
+        </w:rPr>
+        <w:t>Figure 1: The AuthentiScan Pro widget embedded in a partner news article, showing a credibility assessment alongside the content.</w:t>
       </w:r>
     </w:p>
     <w:p>
@@ -1133,6 +1187,196 @@
                 <w:sz w:val="18"/>
               </w:rPr>
               <w:t>Green</w:t>
+            </w:r>
+          </w:p>
+        </w:tc>
+      </w:tr>
+    </w:tbl>
+    <w:p>
+      <w:r>
+        <w:t>The badge renders in one of three colour states according to the risk score:</w:t>
+      </w:r>
+    </w:p>
+    <w:tbl>
+      <w:tblPr>
+        <w:tblW w:type="auto" w:w="0"/>
+        <w:jc w:val="center"/>
+        <w:tblLook w:firstColumn="1" w:firstRow="1" w:lastColumn="0" w:lastRow="0" w:noHBand="0" w:noVBand="1" w:val="04A0"/>
+      </w:tblPr>
+      <w:tblGrid>
+        <w:gridCol w:w="2880"/>
+        <w:gridCol w:w="2880"/>
+        <w:gridCol w:w="2880"/>
+      </w:tblGrid>
+      <w:tr>
+        <w:tc>
+          <w:tcPr>
+            <w:tcW w:type="dxa" w:w="2880"/>
+          </w:tcPr>
+          <w:p>
+            <w:pPr>
+              <w:jc w:val="center"/>
+            </w:pPr>
+            <w:r>
+              <w:drawing>
+                <wp:inline xmlns:a="http://schemas.openxmlformats.org/drawingml/2006/main" xmlns:pic="http://schemas.openxmlformats.org/drawingml/2006/picture">
+                  <wp:extent cx="1783080" cy="1757895"/>
+                  <wp:docPr id="2" name="Picture 2"/>
+                  <wp:cNvGraphicFramePr>
+                    <a:graphicFrameLocks noChangeAspect="1"/>
+                  </wp:cNvGraphicFramePr>
+                  <a:graphic>
+                    <a:graphicData uri="http://schemas.openxmlformats.org/drawingml/2006/picture">
+                      <pic:pic>
+                        <pic:nvPicPr>
+                          <pic:cNvPr id="0" name="badge_high.png"/>
+                          <pic:cNvPicPr/>
+                        </pic:nvPicPr>
+                        <pic:blipFill>
+                          <a:blip r:embed="rId10"/>
+                          <a:stretch>
+                            <a:fillRect/>
+                          </a:stretch>
+                        </pic:blipFill>
+                        <pic:spPr>
+                          <a:xfrm>
+                            <a:off x="0" y="0"/>
+                            <a:ext cx="1783080" cy="1757895"/>
+                          </a:xfrm>
+                          <a:prstGeom prst="rect"/>
+                        </pic:spPr>
+                      </pic:pic>
+                    </a:graphicData>
+                  </a:graphic>
+                </wp:inline>
+              </w:drawing>
+            </w:r>
+          </w:p>
+          <w:p>
+            <w:pPr>
+              <w:jc w:val="center"/>
+            </w:pPr>
+            <w:r>
+              <w:rPr>
+                <w:i/>
+                <w:color w:val="666666"/>
+                <w:sz w:val="17"/>
+              </w:rPr>
+              <w:t>Figure 2: High Risk</w:t>
+            </w:r>
+          </w:p>
+        </w:tc>
+        <w:tc>
+          <w:tcPr>
+            <w:tcW w:type="dxa" w:w="2880"/>
+          </w:tcPr>
+          <w:p>
+            <w:pPr>
+              <w:jc w:val="center"/>
+            </w:pPr>
+            <w:r>
+              <w:drawing>
+                <wp:inline xmlns:a="http://schemas.openxmlformats.org/drawingml/2006/main" xmlns:pic="http://schemas.openxmlformats.org/drawingml/2006/picture">
+                  <wp:extent cx="1783080" cy="1757895"/>
+                  <wp:docPr id="3" name="Picture 3"/>
+                  <wp:cNvGraphicFramePr>
+                    <a:graphicFrameLocks noChangeAspect="1"/>
+                  </wp:cNvGraphicFramePr>
+                  <a:graphic>
+                    <a:graphicData uri="http://schemas.openxmlformats.org/drawingml/2006/picture">
+                      <pic:pic>
+                        <pic:nvPicPr>
+                          <pic:cNvPr id="0" name="badge_verify.png"/>
+                          <pic:cNvPicPr/>
+                        </pic:nvPicPr>
+                        <pic:blipFill>
+                          <a:blip r:embed="rId11"/>
+                          <a:stretch>
+                            <a:fillRect/>
+                          </a:stretch>
+                        </pic:blipFill>
+                        <pic:spPr>
+                          <a:xfrm>
+                            <a:off x="0" y="0"/>
+                            <a:ext cx="1783080" cy="1757895"/>
+                          </a:xfrm>
+                          <a:prstGeom prst="rect"/>
+                        </pic:spPr>
+                      </pic:pic>
+                    </a:graphicData>
+                  </a:graphic>
+                </wp:inline>
+              </w:drawing>
+            </w:r>
+          </w:p>
+          <w:p>
+            <w:pPr>
+              <w:jc w:val="center"/>
+            </w:pPr>
+            <w:r>
+              <w:rPr>
+                <w:i/>
+                <w:color w:val="666666"/>
+                <w:sz w:val="17"/>
+              </w:rPr>
+              <w:t>Figure 3: Verify</w:t>
+            </w:r>
+          </w:p>
+        </w:tc>
+        <w:tc>
+          <w:tcPr>
+            <w:tcW w:type="dxa" w:w="2880"/>
+          </w:tcPr>
+          <w:p>
+            <w:pPr>
+              <w:jc w:val="center"/>
+            </w:pPr>
+            <w:r>
+              <w:drawing>
+                <wp:inline xmlns:a="http://schemas.openxmlformats.org/drawingml/2006/main" xmlns:pic="http://schemas.openxmlformats.org/drawingml/2006/picture">
+                  <wp:extent cx="1783080" cy="1757895"/>
+                  <wp:docPr id="4" name="Picture 4"/>
+                  <wp:cNvGraphicFramePr>
+                    <a:graphicFrameLocks noChangeAspect="1"/>
+                  </wp:cNvGraphicFramePr>
+                  <a:graphic>
+                    <a:graphicData uri="http://schemas.openxmlformats.org/drawingml/2006/picture">
+                      <pic:pic>
+                        <pic:nvPicPr>
+                          <pic:cNvPr id="0" name="badge_trust.png"/>
+                          <pic:cNvPicPr/>
+                        </pic:nvPicPr>
+                        <pic:blipFill>
+                          <a:blip r:embed="rId12"/>
+                          <a:stretch>
+                            <a:fillRect/>
+                          </a:stretch>
+                        </pic:blipFill>
+                        <pic:spPr>
+                          <a:xfrm>
+                            <a:off x="0" y="0"/>
+                            <a:ext cx="1783080" cy="1757895"/>
+                          </a:xfrm>
+                          <a:prstGeom prst="rect"/>
+                        </pic:spPr>
+                      </pic:pic>
+                    </a:graphicData>
+                  </a:graphic>
+                </wp:inline>
+              </w:drawing>
+            </w:r>
+          </w:p>
+          <w:p>
+            <w:pPr>
+              <w:jc w:val="center"/>
+            </w:pPr>
+            <w:r>
+              <w:rPr>
+                <w:i/>
+                <w:color w:val="666666"/>
+                <w:sz w:val="17"/>
+              </w:rPr>
+              <w:t>Figure 4: Trustworthy</w:t>
             </w:r>
           </w:p>
         </w:tc>

</xml_diff>